<commit_message>
docs: update academic document version history
</commit_message>
<xml_diff>
--- a/docs/academic/C1SE.70_ArchitectureDesign_DBCAS_ver1.1.docx
+++ b/docs/academic/C1SE.70_ArchitectureDesign_DBCAS_ver1.1.docx
@@ -2946,7 +2946,7 @@
               <w:spacing w:after="0" w:line="240" w:lineRule="auto"/>
             </w:pPr>
             <w:r>
-              <w:t>Init</w:t>
+              <w:t>Initial release</w:t>
             </w:r>
           </w:p>
         </w:tc>
@@ -2992,7 +2992,7 @@
               <w:jc w:val="center"/>
             </w:pPr>
             <w:r>
-              <w:t>1.1 (historical)</w:t>
+              <w:t>1.1</w:t>
             </w:r>
           </w:p>
         </w:tc>
@@ -3006,7 +3006,7 @@
               <w:jc w:val="center"/>
             </w:pPr>
             <w:r>
-              <w:t>24/09/2026</w:t>
+              <w:t>30/10/2026</w:t>
             </w:r>
           </w:p>
         </w:tc>
@@ -3038,239 +3038,7 @@
           </w:p>
         </w:tc>
       </w:tr>
-      <w:tr>
-        <w:trPr>
-          <w:cantSplit/>
-          <w:jc w:val="center"/>
-        </w:trPr>
-        <w:tc>
-          <w:tcPr>
-            <w:tcW w:w="1531" w:type="dxa"/>
-          </w:tcPr>
-          <w:p>
-            <w:pPr>
-              <w:jc w:val="center"/>
-            </w:pPr>
-            <w:r>
-              <w:t>1.2</w:t>
-            </w:r>
-          </w:p>
-        </w:tc>
-        <w:tc>
-          <w:tcPr>
-            <w:tcW w:w="1701" w:type="dxa"/>
-          </w:tcPr>
-          <w:p>
-            <w:pPr>
-              <w:jc w:val="center"/>
-            </w:pPr>
-            <w:r>
-              <w:t>02/10/2026</w:t>
-            </w:r>
-          </w:p>
-        </w:tc>
-        <w:tc>
-          <w:tcPr>
-            <w:tcW w:w="4422" w:type="dxa"/>
-          </w:tcPr>
-          <w:p>
-            <w:r>
-              <w:t>Update</w:t>
-            </w:r>
-          </w:p>
-        </w:tc>
-        <w:tc>
-          <w:tcPr>
-            <w:tcW w:w="1701" w:type="dxa"/>
-          </w:tcPr>
-          <w:p>
-            <w:pPr>
-              <w:jc w:val="center"/>
-            </w:pPr>
-            <w:r>
-              <w:t>C1SE.70 Team</w:t>
-            </w:r>
-          </w:p>
-        </w:tc>
-      </w:tr>
-      <w:tr>
-        <w:trPr>
-          <w:cantSplit/>
-          <w:jc w:val="center"/>
-        </w:trPr>
-        <w:tc>
-          <w:tcPr>
-            <w:tcW w:w="1531" w:type="dxa"/>
-          </w:tcPr>
-          <w:p>
-            <w:pPr>
-              <w:jc w:val="center"/>
-            </w:pPr>
-            <w:r>
-              <w:t>1.3</w:t>
-            </w:r>
-          </w:p>
-        </w:tc>
-        <w:tc>
-          <w:tcPr>
-            <w:tcW w:w="1701" w:type="dxa"/>
-          </w:tcPr>
-          <w:p>
-            <w:pPr>
-              <w:jc w:val="center"/>
-            </w:pPr>
-            <w:r>
-              <w:t>22/10/2026</w:t>
-            </w:r>
-          </w:p>
-        </w:tc>
-        <w:tc>
-          <w:tcPr>
-            <w:tcW w:w="4422" w:type="dxa"/>
-          </w:tcPr>
-          <w:p>
-            <w:r>
-              <w:t>Align with the implemented schema and supervisor extensions: personalized assessment, verified result release, OAuth, role management, cumulative competency, translations and 32-table data model.</w:t>
-            </w:r>
-          </w:p>
-        </w:tc>
-        <w:tc>
-          <w:tcPr>
-            <w:tcW w:w="1701" w:type="dxa"/>
-          </w:tcPr>
-          <w:p>
-            <w:pPr>
-              <w:jc w:val="center"/>
-            </w:pPr>
-            <w:r>
-              <w:t>C1SE.70 Team</w:t>
-            </w:r>
-          </w:p>
-        </w:tc>
-      </w:tr>
-      <w:tr>
-        <w:trPr>
-          <w:cantSplit/>
-          <w:jc w:val="center"/>
-        </w:trPr>
-        <w:tc>
-          <w:tcPr>
-            <w:tcW w:w="1531" w:type="dxa"/>
-          </w:tcPr>
-          <w:p>
-            <w:pPr>
-              <w:jc w:val="center"/>
-            </w:pPr>
-            <w:r>
-              <w:t>1.4</w:t>
-            </w:r>
-          </w:p>
-        </w:tc>
-        <w:tc>
-          <w:tcPr>
-            <w:tcW w:w="1701" w:type="dxa"/>
-          </w:tcPr>
-          <w:p>
-            <w:pPr>
-              <w:jc w:val="center"/>
-            </w:pPr>
-            <w:r>
-              <w:t>29/10/2026</w:t>
-            </w:r>
-          </w:p>
-        </w:tc>
-        <w:tc>
-          <w:tcPr>
-            <w:tcW w:w="4422" w:type="dxa"/>
-          </w:tcPr>
-          <w:p>
-            <w:r>
-              <w:t>Assessment views aligned with adaptive formal delivery, frozen practice plans, explicit shortage, opt-in AI generation and learner-only assessment routes.</w:t>
-            </w:r>
-          </w:p>
-        </w:tc>
-        <w:tc>
-          <w:tcPr>
-            <w:tcW w:w="1701" w:type="dxa"/>
-          </w:tcPr>
-          <w:p>
-            <w:pPr>
-              <w:jc w:val="center"/>
-            </w:pPr>
-            <w:r>
-              <w:t>C1SE.70 Team</w:t>
-            </w:r>
-          </w:p>
-        </w:tc>
-      </w:tr>
-      <w:tr>
-        <w:trPr>
-          <w:cantSplit/>
-          <w:jc w:val="center"/>
-        </w:trPr>
-        <w:tc>
-          <w:tcPr>
-            <w:tcW w:w="1531" w:type="dxa"/>
-          </w:tcPr>
-          <w:p>
-            <w:pPr>
-              <w:jc w:val="center"/>
-            </w:pPr>
-            <w:r>
-              <w:t>1.1</w:t>
-            </w:r>
-          </w:p>
-        </w:tc>
-        <w:tc>
-          <w:tcPr>
-            <w:tcW w:w="1701" w:type="dxa"/>
-          </w:tcPr>
-          <w:p>
-            <w:pPr>
-              <w:jc w:val="center"/>
-            </w:pPr>
-            <w:r>
-              <w:t>30/10/2026</w:t>
-            </w:r>
-          </w:p>
-        </w:tc>
-        <w:tc>
-          <w:tcPr>
-            <w:tcW w:w="4422" w:type="dxa"/>
-          </w:tcPr>
-          <w:p>
-            <w:r>
-              <w:t>Unified published baseline: implementation-aligned content, adaptive formal delivery, BANK/AI source modes, 36-table schema, password recovery, role separation and release/privacy guarantees.</w:t>
-            </w:r>
-          </w:p>
-        </w:tc>
-        <w:tc>
-          <w:tcPr>
-            <w:tcW w:w="1701" w:type="dxa"/>
-          </w:tcPr>
-          <w:p>
-            <w:pPr>
-              <w:jc w:val="center"/>
-            </w:pPr>
-            <w:r>
-              <w:t>C1SE.70 Team</w:t>
-            </w:r>
-          </w:p>
-        </w:tc>
-      </w:tr>
     </w:tbl>
-    <w:p>
-      <w:pPr>
-        <w:spacing w:before="80"/>
-      </w:pPr>
-      <w:r>
-        <w:rPr>
-          <w:i/>
-          <w:sz w:val="18"/>
-        </w:rPr>
-        <w:t>Versioning note: this table preserves the document's real working history. Revisions 1.2–1.4 were successive working drafts prepared after the original 1.1. For publication, the Proposal, User Story, System Architecture and Database Design are released together as the single v1.1 baseline; the original 1.1 row is retained as historical, and the new 1.1 row records this unified publication. No historical date, author or approval has been changed.</w:t>
-      </w:r>
-    </w:p>
     <w:p>
       <w:pPr>
         <w:sectPr>

</xml_diff>